<commit_message>
feat: updated resume button in navbar to have its own pdf modal
</commit_message>
<xml_diff>
--- a/assets/OscarBerrigan_Resume_2026.docx
+++ b/assets/OscarBerrigan_Resume_2026.docx
@@ -70,37 +70,6 @@
           <w:rFonts w:ascii="Times New Roman" w:hAnsi="Times New Roman" w:cs="Times New Roman"/>
         </w:rPr>
         <w:t xml:space="preserve"> | </w:t>
-      </w:r>
-      <w:r>
-        <w:rPr>
-          <w:rFonts w:ascii="Times New Roman" w:hAnsi="Times New Roman" w:cs="Times New Roman"/>
-        </w:rPr>
-        <w:t>berrigos@dukes.jmu.edu</w:t>
-      </w:r>
-      <w:r>
-        <w:rPr>
-          <w:rFonts w:ascii="Times New Roman" w:hAnsi="Times New Roman" w:cs="Times New Roman"/>
-        </w:rPr>
-        <w:t xml:space="preserve"> |</w:t>
-      </w:r>
-    </w:p>
-    <w:p>
-      <w:pPr>
-        <w:tabs>
-          <w:tab w:val="right" w:pos="9990"/>
-        </w:tabs>
-        <w:spacing w:line="240" w:lineRule="auto"/>
-        <w:contextualSpacing/>
-        <w:jc w:val="center"/>
-        <w:rPr>
-          <w:rFonts w:ascii="Times New Roman" w:hAnsi="Times New Roman" w:cs="Times New Roman"/>
-        </w:rPr>
-      </w:pPr>
-      <w:r>
-        <w:rPr>
-          <w:rFonts w:ascii="Times New Roman" w:hAnsi="Times New Roman" w:cs="Times New Roman"/>
-        </w:rPr>
-        <w:t xml:space="preserve"> </w:t>
       </w:r>
       <w:hyperlink r:id="rId10" w:history="1">
         <w:r>
@@ -108,21 +77,47 @@
             <w:rStyle w:val="Hyperlink"/>
             <w:rFonts w:ascii="Times New Roman" w:hAnsi="Times New Roman" w:cs="Times New Roman"/>
           </w:rPr>
-          <w:t>linkedin.c</w:t>
+          <w:t>oscarberrigan@gmail.com</w:t>
         </w:r>
+      </w:hyperlink>
+      <w:r>
+        <w:rPr>
+          <w:rFonts w:ascii="Times New Roman" w:hAnsi="Times New Roman" w:cs="Times New Roman"/>
+        </w:rPr>
+        <w:t xml:space="preserve"> </w:t>
+      </w:r>
+      <w:r>
+        <w:rPr>
+          <w:rFonts w:ascii="Times New Roman" w:hAnsi="Times New Roman" w:cs="Times New Roman"/>
+        </w:rPr>
+        <w:t>|</w:t>
+      </w:r>
+    </w:p>
+    <w:p>
+      <w:pPr>
+        <w:tabs>
+          <w:tab w:val="right" w:pos="9990"/>
+        </w:tabs>
+        <w:spacing w:line="240" w:lineRule="auto"/>
+        <w:contextualSpacing/>
+        <w:jc w:val="center"/>
+        <w:rPr>
+          <w:rFonts w:ascii="Times New Roman" w:hAnsi="Times New Roman" w:cs="Times New Roman"/>
+        </w:rPr>
+      </w:pPr>
+      <w:r>
+        <w:rPr>
+          <w:rFonts w:ascii="Times New Roman" w:hAnsi="Times New Roman" w:cs="Times New Roman"/>
+        </w:rPr>
+        <w:t xml:space="preserve"> </w:t>
+      </w:r>
+      <w:hyperlink r:id="rId11" w:history="1">
         <w:r>
           <w:rPr>
             <w:rStyle w:val="Hyperlink"/>
             <w:rFonts w:ascii="Times New Roman" w:hAnsi="Times New Roman" w:cs="Times New Roman"/>
           </w:rPr>
-          <w:t>o</w:t>
-        </w:r>
-        <w:r>
-          <w:rPr>
-            <w:rStyle w:val="Hyperlink"/>
-            <w:rFonts w:ascii="Times New Roman" w:hAnsi="Times New Roman" w:cs="Times New Roman"/>
-          </w:rPr>
-          <w:t>m/in/</w:t>
+          <w:t>linkedin.com/in/</w:t>
         </w:r>
         <w:r>
           <w:rPr>
@@ -135,27 +130,25 @@
       <w:r>
         <w:t xml:space="preserve"> | </w:t>
       </w:r>
-      <w:hyperlink r:id="rId11" w:history="1">
+      <w:hyperlink r:id="rId12" w:history="1">
         <w:r>
           <w:rPr>
             <w:rStyle w:val="Hyperlink"/>
             <w:rFonts w:ascii="Times New Roman" w:hAnsi="Times New Roman" w:cs="Times New Roman"/>
           </w:rPr>
-          <w:t>https://github.com/ItsOsca</w:t>
+          <w:t>github.com/ItsOscarr05</w:t>
         </w:r>
+      </w:hyperlink>
+      <w:r>
+        <w:t xml:space="preserve"> | </w:t>
+      </w:r>
+      <w:hyperlink r:id="rId13" w:history="1">
         <w:r>
           <w:rPr>
             <w:rStyle w:val="Hyperlink"/>
             <w:rFonts w:ascii="Times New Roman" w:hAnsi="Times New Roman" w:cs="Times New Roman"/>
           </w:rPr>
-          <w:t>r</w:t>
-        </w:r>
-        <w:r>
-          <w:rPr>
-            <w:rStyle w:val="Hyperlink"/>
-            <w:rFonts w:ascii="Times New Roman" w:hAnsi="Times New Roman" w:cs="Times New Roman"/>
-          </w:rPr>
-          <w:t>r05</w:t>
+          <w:t>https://oscarberrigan.com/</w:t>
         </w:r>
       </w:hyperlink>
     </w:p>
@@ -407,13 +400,25 @@
           <w:b/>
           <w:bCs/>
         </w:rPr>
-        <w:t>Languages</w:t>
-      </w:r>
-      <w:r>
-        <w:rPr>
-          <w:rFonts w:ascii="Times New Roman" w:hAnsi="Times New Roman" w:cs="Times New Roman"/>
-        </w:rPr>
-        <w:t>: Java, Python, SQL</w:t>
+        <w:t>Data &amp; Analytics:</w:t>
+      </w:r>
+      <w:r>
+        <w:rPr>
+          <w:rFonts w:ascii="Times New Roman" w:hAnsi="Times New Roman" w:cs="Times New Roman"/>
+        </w:rPr>
+        <w:t xml:space="preserve"> Microsoft Excel (Advanced), Microsoft Power BI,</w:t>
+      </w:r>
+      <w:r>
+        <w:rPr>
+          <w:rFonts w:ascii="Times New Roman" w:hAnsi="Times New Roman" w:cs="Times New Roman"/>
+        </w:rPr>
+        <w:t xml:space="preserve"> </w:t>
+      </w:r>
+      <w:r>
+        <w:rPr>
+          <w:rFonts w:ascii="Times New Roman" w:hAnsi="Times New Roman" w:cs="Times New Roman"/>
+        </w:rPr>
+        <w:t>Data Analysis, Data Visualization</w:t>
       </w:r>
     </w:p>
     <w:p>
@@ -433,13 +438,25 @@
           <w:b/>
           <w:bCs/>
         </w:rPr>
-        <w:t>Data &amp; Analytics:</w:t>
-      </w:r>
-      <w:r>
-        <w:rPr>
-          <w:rFonts w:ascii="Times New Roman" w:hAnsi="Times New Roman" w:cs="Times New Roman"/>
-        </w:rPr>
-        <w:t xml:space="preserve"> Microsoft Excel (Advanced), Microsoft Power BI, SQL, Data Analysis, Data Visualization</w:t>
+        <w:t>Languages</w:t>
+      </w:r>
+      <w:r>
+        <w:rPr>
+          <w:rFonts w:ascii="Times New Roman" w:hAnsi="Times New Roman" w:cs="Times New Roman"/>
+        </w:rPr>
+        <w:t xml:space="preserve">: </w:t>
+      </w:r>
+      <w:r>
+        <w:rPr>
+          <w:rFonts w:ascii="Times New Roman" w:hAnsi="Times New Roman" w:cs="Times New Roman"/>
+        </w:rPr>
+        <w:t>Microsoft VBA, SQL, Python, Java</w:t>
+      </w:r>
+      <w:r>
+        <w:rPr>
+          <w:rFonts w:ascii="Times New Roman" w:hAnsi="Times New Roman" w:cs="Times New Roman"/>
+        </w:rPr>
+        <w:t>, HTML &amp; CSS</w:t>
       </w:r>
     </w:p>
     <w:p>
@@ -465,21 +482,7 @@
         <w:rPr>
           <w:rFonts w:ascii="Times New Roman" w:hAnsi="Times New Roman" w:cs="Times New Roman"/>
         </w:rPr>
-        <w:t xml:space="preserve"> </w:t>
-      </w:r>
-      <w:proofErr w:type="spellStart"/>
-      <w:r>
-        <w:rPr>
-          <w:rFonts w:ascii="Times New Roman" w:hAnsi="Times New Roman" w:cs="Times New Roman"/>
-        </w:rPr>
-        <w:t>Supabase</w:t>
-      </w:r>
-      <w:proofErr w:type="spellEnd"/>
-      <w:r>
-        <w:rPr>
-          <w:rFonts w:ascii="Times New Roman" w:hAnsi="Times New Roman" w:cs="Times New Roman"/>
-        </w:rPr>
-        <w:t>, Vercel, OpenAI API, Git/GitHub</w:t>
+        <w:t xml:space="preserve"> Supabase, Vercel, OpenAI API, Git/GitHub</w:t>
       </w:r>
     </w:p>
     <w:p>
@@ -669,7 +672,7 @@
         <w:rPr>
           <w:rFonts w:ascii="Times New Roman" w:hAnsi="Times New Roman" w:cs="Times New Roman"/>
         </w:rPr>
-        <w:t xml:space="preserve">Python for Beginners </w:t>
+        <w:t>Complete Python Bootcamp</w:t>
       </w:r>
     </w:p>
     <w:p>
@@ -1058,7 +1061,6 @@
         </w:rPr>
         <w:t xml:space="preserve">Designed and structured full-stack application architectures using tools such as Python, </w:t>
       </w:r>
-      <w:proofErr w:type="spellStart"/>
       <w:r>
         <w:rPr>
           <w:rFonts w:ascii="Times New Roman" w:hAnsi="Times New Roman" w:cs="Times New Roman"/>
@@ -1069,14 +1071,7 @@
         <w:rPr>
           <w:rFonts w:ascii="Times New Roman" w:hAnsi="Times New Roman" w:cs="Times New Roman"/>
         </w:rPr>
-        <w:t>base</w:t>
-      </w:r>
-      <w:proofErr w:type="spellEnd"/>
-      <w:r>
-        <w:rPr>
-          <w:rFonts w:ascii="Times New Roman" w:hAnsi="Times New Roman" w:cs="Times New Roman"/>
-        </w:rPr>
-        <w:t xml:space="preserve">, </w:t>
+        <w:t xml:space="preserve">base, </w:t>
       </w:r>
       <w:r>
         <w:rPr>
@@ -3599,21 +3594,6 @@
 </file>
 
 <file path=customXml/item1.xml><?xml version="1.0" encoding="utf-8"?>
-<?mso-contentType ?>
-<FormTemplates xmlns="http://schemas.microsoft.com/sharepoint/v3/contenttype/forms">
-  <Display>DocumentLibraryForm</Display>
-  <Edit>DocumentLibraryForm</Edit>
-  <New>DocumentLibraryForm</New>
-</FormTemplates>
-</file>
-
-<file path=customXml/item2.xml><?xml version="1.0" encoding="utf-8"?>
-<p:properties xmlns:p="http://schemas.microsoft.com/office/2006/metadata/properties" xmlns:xsi="http://www.w3.org/2001/XMLSchema-instance" xmlns:pc="http://schemas.microsoft.com/office/infopath/2007/PartnerControls">
-  <documentManagement/>
-</p:properties>
-</file>
-
-<file path=customXml/item3.xml><?xml version="1.0" encoding="utf-8"?>
 <ct:contentTypeSchema xmlns:ct="http://schemas.microsoft.com/office/2006/metadata/contentType" xmlns:ma="http://schemas.microsoft.com/office/2006/metadata/properties/metaAttributes" ct:_="" ma:_="" ma:contentTypeName="Document" ma:contentTypeID="0x0101006099E90DEF68C44FBADD979A23296F21" ma:contentTypeVersion="0" ma:contentTypeDescription="Create a new document." ma:contentTypeScope="" ma:versionID="6645ddf6b9fa259602343a07927057a1">
   <xsd:schema xmlns:xsd="http://www.w3.org/2001/XMLSchema" xmlns:xs="http://www.w3.org/2001/XMLSchema" xmlns:p="http://schemas.microsoft.com/office/2006/metadata/properties" targetNamespace="http://schemas.microsoft.com/office/2006/metadata/properties" ma:root="true" ma:fieldsID="31d5eec3c12ee2e8127422d567928fa7">
     <xsd:element name="properties">
@@ -3727,10 +3707,33 @@
 </ct:contentTypeSchema>
 </file>
 
+<file path=customXml/item2.xml><?xml version="1.0" encoding="utf-8"?>
+<p:properties xmlns:p="http://schemas.microsoft.com/office/2006/metadata/properties" xmlns:xsi="http://www.w3.org/2001/XMLSchema-instance" xmlns:pc="http://schemas.microsoft.com/office/infopath/2007/PartnerControls">
+  <documentManagement/>
+</p:properties>
+</file>
+
+<file path=customXml/item3.xml><?xml version="1.0" encoding="utf-8"?>
+<?mso-contentType ?>
+<FormTemplates xmlns="http://schemas.microsoft.com/sharepoint/v3/contenttype/forms">
+  <Display>DocumentLibraryForm</Display>
+  <Edit>DocumentLibraryForm</Edit>
+  <New>DocumentLibraryForm</New>
+</FormTemplates>
+</file>
+
 <file path=customXml/itemProps1.xml><?xml version="1.0" encoding="utf-8"?>
-<ds:datastoreItem xmlns:ds="http://schemas.openxmlformats.org/officeDocument/2006/customXml" ds:itemID="{6D651868-795D-4D8C-AABB-69AD6803932F}">
+<ds:datastoreItem xmlns:ds="http://schemas.openxmlformats.org/officeDocument/2006/customXml" ds:itemID="{448809B7-C4CB-4E69-8BB8-F15D9C9D1FE5}">
   <ds:schemaRefs>
-    <ds:schemaRef ds:uri="http://schemas.microsoft.com/sharepoint/v3/contenttype/forms"/>
+    <ds:schemaRef ds:uri="http://schemas.microsoft.com/office/2006/metadata/contentType"/>
+    <ds:schemaRef ds:uri="http://schemas.microsoft.com/office/2006/metadata/properties/metaAttributes"/>
+    <ds:schemaRef ds:uri="http://www.w3.org/2001/XMLSchema"/>
+    <ds:schemaRef ds:uri="http://schemas.microsoft.com/office/2006/metadata/properties"/>
+    <ds:schemaRef ds:uri="http://schemas.openxmlformats.org/package/2006/metadata/core-properties"/>
+    <ds:schemaRef ds:uri="http://purl.org/dc/elements/1.1/"/>
+    <ds:schemaRef ds:uri="http://purl.org/dc/terms/"/>
+    <ds:schemaRef ds:uri="http://schemas.microsoft.com/internal/obd"/>
+    <ds:schemaRef ds:uri="http://schemas.microsoft.com/office/infopath/2007/PartnerControls"/>
   </ds:schemaRefs>
 </ds:datastoreItem>
 </file>
@@ -3745,17 +3748,9 @@
 </file>
 
 <file path=customXml/itemProps3.xml><?xml version="1.0" encoding="utf-8"?>
-<ds:datastoreItem xmlns:ds="http://schemas.openxmlformats.org/officeDocument/2006/customXml" ds:itemID="{448809B7-C4CB-4E69-8BB8-F15D9C9D1FE5}">
+<ds:datastoreItem xmlns:ds="http://schemas.openxmlformats.org/officeDocument/2006/customXml" ds:itemID="{6D651868-795D-4D8C-AABB-69AD6803932F}">
   <ds:schemaRefs>
-    <ds:schemaRef ds:uri="http://schemas.microsoft.com/office/2006/metadata/contentType"/>
-    <ds:schemaRef ds:uri="http://schemas.microsoft.com/office/2006/metadata/properties/metaAttributes"/>
-    <ds:schemaRef ds:uri="http://www.w3.org/2001/XMLSchema"/>
-    <ds:schemaRef ds:uri="http://schemas.microsoft.com/office/2006/metadata/properties"/>
-    <ds:schemaRef ds:uri="http://schemas.openxmlformats.org/package/2006/metadata/core-properties"/>
-    <ds:schemaRef ds:uri="http://purl.org/dc/elements/1.1/"/>
-    <ds:schemaRef ds:uri="http://purl.org/dc/terms/"/>
-    <ds:schemaRef ds:uri="http://schemas.microsoft.com/internal/obd"/>
-    <ds:schemaRef ds:uri="http://schemas.microsoft.com/office/infopath/2007/PartnerControls"/>
+    <ds:schemaRef ds:uri="http://schemas.microsoft.com/sharepoint/v3/contenttype/forms"/>
   </ds:schemaRefs>
 </ds:datastoreItem>
 </file>
</xml_diff>